<commit_message>
Cerrar las escalas de activación de las 3 categorías no aeronáuticas
Basado en los Excel reales de Epidemiológica, Estructural/Incidentes y MATPEL
(carpeta LAP en Drive), confirmado con Renzo el 2026-07-21:

- Epidemiológica: triaje EMERGENCIA/URGENCIA/CONSULTA ya registrado, mapeado
  a activación general/parcial/monitoreo.
- Estructural/Incidentes: campo ya registrado Incidente/Estructural, mapeado
  a activación general/parcial.
- MATPEL: Clasificación MATPEL de 9 categorías UN ya registrada, sin mapeo a
  niveles de activación (se usa tal cual, análoga a Tipo de Alerta en
  Aeronáutica).

Actualiza PRD_PCE_JorgeChavez.2 (docx + md) y TECH-DESIGN.md, que tenía esto
listado como riesgo técnico abierto.

Co-Authored-By: Claude Sonnet 5 <noreply@anthropic.com>
</commit_message>
<xml_diff>
--- a/PRD_PCE_JorgeChavez.2.docx
+++ b/PRD_PCE_JorgeChavez.2.docx
@@ -2283,7 +2283,19 @@
         <w:rPr>
           <w:lang w:val="es-PE"/>
         </w:rPr>
-        <w:t xml:space="preserve">Registro de activación de emergencia con nivel de Alerta (I/II/III para eventos aeronáuticos; cada una de las otras 3 categorías con su propia escala diferenciada, confirmado que no comparten la escala aeronáutica — Renzo, 2026-07-17; detalle de cada escala aún por definir) </w:t>
+        <w:t xml:space="preserve">Registro de activación de emergencia con nivel de Alerta (I/II/III para eventos aeronáuticos; cada una de las otras 3 categorías con su propia escala diferenciada, confirmado que no comparten la escala aeronáutica — Renzo, 2026-07-17; </w:t>
+      </w:r>
+      <w:r>
+        <w:rPr>
+          <w:lang w:val="es-PE"/>
+        </w:rPr>
+        <w:t>detalle de cada escala cerrado — Renzo, 2026-07-21, ver sección 8</w:t>
+      </w:r>
+      <w:r>
+        <w:rPr>
+          <w:lang w:val="es-PE"/>
+        </w:rPr>
+        <w:t xml:space="preserve">) </w:t>
       </w:r>
       <w:r>
         <w:rPr>
@@ -2928,8 +2940,96 @@
         <w:rPr>
           <w:lang w:val="es-PE"/>
         </w:rPr>
-        <w:t>Confirmado (Renzo, 2026-07-17) — las 3 categorías no aeronáuticas (Epidemiológica, Estructural/Incidentes, MATPEL) no comparten la escala I/II/III aeronáutica: cada una maneja su propia escala de activación diferenciada. El detalle específico de cada escala queda pendiente de definir formalmente (ver sección 6).</w:t>
-      </w:r>
+        <w:t xml:space="preserve">Confirmado (Renzo, 2026-07-17) — las 3 categorías no aeronáuticas (Epidemiológica, Estructural/Incidentes, MATPEL) no comparten la escala I/II/III aeronáutica: cada una maneja su propia escala de activación diferenciada. </w:t>
+      </w:r>
+    </w:p>
+    <w:p>
+      <w:pPr>
+        <w:pStyle w:val="Ttulo1"/>
+        <w:rPr>
+          <w:lang w:val="es-PE"/>
+        </w:rPr>
+      </w:pPr>
+      <w:r>
+        <w:rPr>
+          <w:lang w:val="es-PE"/>
+        </w:rPr>
+        <w:t>Confirmado (Renzo, 2026-07-21) — detalle de la escala de activación diferenciada de cada categoría no aeronáutica (basado en los campos ya usados en 'Cuadro Estadístico de Emergencias Epidemiológicas 2026.xlsx', 'Cuadro Estadístico de Emergencias Estructurales e Incidentes 2026.xlsx' y 'Cuadro Estadístico de Emergencia MATPEL 2026.xlsx'):</w:t>
+      </w:r>
+    </w:p>
+    <w:p>
+      <w:pPr>
+        <w:pStyle w:val="Textoindependiente"/>
+        <w:rPr>
+          <w:lang w:val="es-PE"/>
+        </w:rPr>
+      </w:pPr>
+      <w:r>
+        <w:rPr>
+          <w:lang w:val="es-PE"/>
+        </w:rPr>
+        <w:t>Epidemiológica usa el triaje ya registrado (campo Clasificación de la emergencia): EMERGENCIA activación general, URGENCIA activación parcial, CONSULTA monitoreo.</w:t>
+      </w:r>
+    </w:p>
+    <w:p>
+      <w:pPr>
+        <w:pStyle w:val="Textoindependiente"/>
+        <w:rPr>
+          <w:lang w:val="es-PE"/>
+        </w:rPr>
+      </w:pPr>
+      <w:r>
+        <w:rPr>
+          <w:lang w:val="es-PE"/>
+        </w:rPr>
+        <w:t>Estructural/Incidentes usa el campo ya registrado Incidente / Estructural: Estructural activación general, Incidente activación parcial.</w:t>
+      </w:r>
+    </w:p>
+    <w:p>
+      <w:pPr>
+        <w:pStyle w:val="Textoindependiente"/>
+        <w:rPr>
+          <w:lang w:val="es-PE"/>
+        </w:rPr>
+      </w:pPr>
+      <w:r>
+        <w:rPr>
+          <w:lang w:val="es-PE"/>
+        </w:rPr>
+        <w:t>MATPEL usa la Clasificación MATPEL ya registrada, de 9 categorías por tipo de material (Clase 1 Explosivos, Clase 2 Gases, Clase 3 Líquidos inflamables, Clase 4 Sólidos inflamables, Clase 5 Oxidantes y peróxidos, Clase 6 Tóxicas e infecciosas, Clase 7 Radiactivos, Clase 8 Corrosivas, Clase 9 Misceláneos), sin mapeo a niveles de activación general/parcial/monitoreo, se usa tal cual como clasificación.</w:t>
+      </w:r>
+    </w:p>
+    <w:p>
+      <w:pPr>
+        <w:pStyle w:val="Textoindependiente"/>
+        <w:rPr>
+          <w:lang w:val="es-PE"/>
+        </w:rPr>
+      </w:pPr>
+    </w:p>
+    <w:p>
+      <w:pPr>
+        <w:pStyle w:val="Ttulo1"/>
+        <w:rPr>
+          <w:lang w:val="es-PE"/>
+        </w:rPr>
+      </w:pPr>
+    </w:p>
+    <w:p>
+      <w:pPr>
+        <w:pStyle w:val="Ttulo1"/>
+        <w:rPr>
+          <w:lang w:val="es-PE"/>
+        </w:rPr>
+      </w:pPr>
+    </w:p>
+    <w:p>
+      <w:pPr>
+        <w:pStyle w:val="Ttulo1"/>
+        <w:rPr>
+          <w:lang w:val="es-PE"/>
+        </w:rPr>
+      </w:pPr>
     </w:p>
     <w:p>
       <w:pPr>

</xml_diff>